<commit_message>
chore(content): remove three ink drawings from Sadik-IN 2026.docx
The LITERATURE paragraph opened with three stray ink drawings (Word ink
annotations, mc:AlternateContent runs with no text, 10,915 bytes of XML).
They made PUBLICATIONS swallow LITERATURE before the parser fix (a719fa8).
Removed byte-for-byte from word/document.xml; no text changed. Only
word/document.xml differs in the package (every other entry identical; the
now-unused ink parts stay, which Word drops on its next save). Checked:
unzip -t, entry order, xmllint, LibreOffice text identical and page render
identical, the site's parser gives identical fields. The site output is
unchanged (cold build: no file differs, Zenodo hash unchanged).
Bob must use this file as his new master copy.
</commit_message>
<xml_diff>
--- a/src/content/bios/Sadik-IN 2026.docx
+++ b/src/content/bios/Sadik-IN 2026.docx
@@ -2682,241 +2682,6 @@
           <w:color w:val="000000"/>
         </w:rPr>
       </w:pPr>
-      <w:r>
-        <w:rPr>
-          <w:rFonts w:cs="Times New Roman"/>
-          <w:b/>
-          <w:noProof/>
-          <w:color w:val="000000"/>
-        </w:rPr>
-        <mc:AlternateContent>
-          <mc:Choice Requires="aink">
-            <w:drawing>
-              <wp:anchor distT="0" distB="0" distL="114300" distR="114300" simplePos="0" relativeHeight="251666432" behindDoc="0" locked="0" layoutInCell="1" allowOverlap="1" wp14:anchorId="6170E4F6" wp14:editId="509099A2">
-                <wp:simplePos x="0" y="0"/>
-                <wp:positionH relativeFrom="column">
-                  <wp:posOffset>6355080</wp:posOffset>
-                </wp:positionH>
-                <wp:positionV relativeFrom="paragraph">
-                  <wp:posOffset>2345055</wp:posOffset>
-                </wp:positionV>
-                <wp:extent cx="27940" cy="25125"/>
-                <wp:effectExtent l="38100" t="25400" r="35560" b="38735"/>
-                <wp:wrapNone/>
-                <wp:docPr id="1527841753" name="Inkt 11"/>
-                <wp:cNvGraphicFramePr/>
-                <a:graphic xmlns:a="http://schemas.openxmlformats.org/drawingml/2006/main">
-                  <a:graphicData uri="http://schemas.microsoft.com/office/word/2010/wordprocessingInk">
-                    <w14:contentPart bwMode="auto" r:id="rId7">
-                      <w14:nvContentPartPr>
-                        <w14:cNvContentPartPr/>
-                      </w14:nvContentPartPr>
-                      <w14:xfrm>
-                        <a:off x="0" y="0"/>
-                        <a:ext cx="27940" cy="25125"/>
-                      </w14:xfrm>
-                    </w14:contentPart>
-                  </a:graphicData>
-                </a:graphic>
-              </wp:anchor>
-            </w:drawing>
-          </mc:Choice>
-          <mc:Fallback>
-            <w:drawing>
-              <wp:anchor distT="0" distB="0" distL="114300" distR="114300" simplePos="0" relativeHeight="251666432" behindDoc="0" locked="0" layoutInCell="1" allowOverlap="1" wp14:anchorId="6170E4F6" wp14:editId="509099A2">
-                <wp:simplePos x="0" y="0"/>
-                <wp:positionH relativeFrom="column">
-                  <wp:posOffset>6355080</wp:posOffset>
-                </wp:positionH>
-                <wp:positionV relativeFrom="paragraph">
-                  <wp:posOffset>2345055</wp:posOffset>
-                </wp:positionV>
-                <wp:extent cx="27940" cy="25125"/>
-                <wp:effectExtent l="38100" t="25400" r="35560" b="38735"/>
-                <wp:wrapNone/>
-                <wp:docPr id="1527841753" name="Inkt 11"/>
-                <wp:cNvGraphicFramePr/>
-                <a:graphic xmlns:a="http://schemas.openxmlformats.org/drawingml/2006/main">
-                  <a:graphicData uri="http://schemas.openxmlformats.org/drawingml/2006/picture">
-                    <pic:pic xmlns:pic="http://schemas.openxmlformats.org/drawingml/2006/picture">
-                      <pic:nvPicPr>
-                        <pic:cNvPr id="1527841753" name="Inkt 11"/>
-                        <pic:cNvPicPr/>
-                      </pic:nvPicPr>
-                      <pic:blipFill>
-                        <a:blip r:embed="rId12"/>
-                        <a:stretch>
-                          <a:fillRect/>
-                        </a:stretch>
-                      </pic:blipFill>
-                      <pic:spPr>
-                        <a:xfrm>
-                          <a:off x="0" y="0"/>
-                          <a:ext cx="62953" cy="240123"/>
-                        </a:xfrm>
-                        <a:prstGeom prst="rect">
-                          <a:avLst/>
-                        </a:prstGeom>
-                      </pic:spPr>
-                    </pic:pic>
-                  </a:graphicData>
-                </a:graphic>
-              </wp:anchor>
-            </w:drawing>
-          </mc:Fallback>
-        </mc:AlternateContent>
-      </w:r>
-      <w:r>
-        <w:rPr>
-          <w:rFonts w:cs="Times New Roman"/>
-          <w:b/>
-          <w:noProof/>
-          <w:color w:val="000000"/>
-        </w:rPr>
-        <mc:AlternateContent>
-          <mc:Choice Requires="aink">
-            <w:drawing>
-              <wp:anchor distT="0" distB="0" distL="114300" distR="114300" simplePos="0" relativeHeight="251662336" behindDoc="0" locked="0" layoutInCell="1" allowOverlap="1" wp14:anchorId="4422BE5E" wp14:editId="7FE5EA47">
-                <wp:simplePos x="0" y="0"/>
-                <wp:positionH relativeFrom="column">
-                  <wp:posOffset>5753625</wp:posOffset>
-                </wp:positionH>
-                <wp:positionV relativeFrom="paragraph">
-                  <wp:posOffset>2312365</wp:posOffset>
-                </wp:positionV>
-                <wp:extent cx="360" cy="360"/>
-                <wp:effectExtent l="38100" t="25400" r="25400" b="38100"/>
-                <wp:wrapNone/>
-                <wp:docPr id="1245403776" name="Inkt 7"/>
-                <wp:cNvGraphicFramePr/>
-                <a:graphic xmlns:a="http://schemas.openxmlformats.org/drawingml/2006/main">
-                  <a:graphicData uri="http://schemas.microsoft.com/office/word/2010/wordprocessingInk">
-                    <w14:contentPart bwMode="auto" r:id="rId13">
-                      <w14:nvContentPartPr>
-                        <w14:cNvContentPartPr/>
-                      </w14:nvContentPartPr>
-                      <w14:xfrm>
-                        <a:off x="0" y="0"/>
-                        <a:ext cx="360" cy="360"/>
-                      </w14:xfrm>
-                    </w14:contentPart>
-                  </a:graphicData>
-                </a:graphic>
-              </wp:anchor>
-            </w:drawing>
-          </mc:Choice>
-          <mc:Fallback>
-            <w:drawing>
-              <wp:anchor distT="0" distB="0" distL="114300" distR="114300" simplePos="0" relativeHeight="251662336" behindDoc="0" locked="0" layoutInCell="1" allowOverlap="1" wp14:anchorId="4422BE5E" wp14:editId="7FE5EA47">
-                <wp:simplePos x="0" y="0"/>
-                <wp:positionH relativeFrom="column">
-                  <wp:posOffset>5753625</wp:posOffset>
-                </wp:positionH>
-                <wp:positionV relativeFrom="paragraph">
-                  <wp:posOffset>2312365</wp:posOffset>
-                </wp:positionV>
-                <wp:extent cx="360" cy="360"/>
-                <wp:effectExtent l="38100" t="25400" r="25400" b="38100"/>
-                <wp:wrapNone/>
-                <wp:docPr id="1245403776" name="Inkt 7"/>
-                <wp:cNvGraphicFramePr/>
-                <a:graphic xmlns:a="http://schemas.openxmlformats.org/drawingml/2006/main">
-                  <a:graphicData uri="http://schemas.openxmlformats.org/drawingml/2006/picture">
-                    <pic:pic xmlns:pic="http://schemas.openxmlformats.org/drawingml/2006/picture">
-                      <pic:nvPicPr>
-                        <pic:cNvPr id="1245403776" name="Inkt 7"/>
-                        <pic:cNvPicPr/>
-                      </pic:nvPicPr>
-                      <pic:blipFill>
-                        <a:blip r:embed="rId14"/>
-                        <a:stretch>
-                          <a:fillRect/>
-                        </a:stretch>
-                      </pic:blipFill>
-                      <pic:spPr>
-                        <a:xfrm>
-                          <a:off x="0" y="0"/>
-                          <a:ext cx="36000" cy="216000"/>
-                        </a:xfrm>
-                        <a:prstGeom prst="rect">
-                          <a:avLst/>
-                        </a:prstGeom>
-                      </pic:spPr>
-                    </pic:pic>
-                  </a:graphicData>
-                </a:graphic>
-              </wp:anchor>
-            </w:drawing>
-          </mc:Fallback>
-        </mc:AlternateContent>
-      </w:r>
-      <w:r>
-        <w:rPr>
-          <w:rFonts w:cs="Times New Roman"/>
-          <w:b/>
-          <w:noProof/>
-          <w:color w:val="000000"/>
-        </w:rPr>
-        <mc:AlternateContent>
-          <mc:Choice Requires="wpi">
-            <w:drawing>
-              <wp:anchor distT="0" distB="0" distL="114300" distR="114300" simplePos="0" relativeHeight="251659264" behindDoc="0" locked="0" layoutInCell="1" allowOverlap="1" wp14:anchorId="3A9ACAD2" wp14:editId="5349145B">
-                <wp:simplePos x="0" y="0"/>
-                <wp:positionH relativeFrom="column">
-                  <wp:posOffset>1856265</wp:posOffset>
-                </wp:positionH>
-                <wp:positionV relativeFrom="paragraph">
-                  <wp:posOffset>2578765</wp:posOffset>
-                </wp:positionV>
-                <wp:extent cx="360" cy="360"/>
-                <wp:effectExtent l="88900" t="139700" r="88900" b="139700"/>
-                <wp:wrapNone/>
-                <wp:docPr id="560055292" name="Inkt 4"/>
-                <wp:cNvGraphicFramePr/>
-                <a:graphic xmlns:a="http://schemas.openxmlformats.org/drawingml/2006/main">
-                  <a:graphicData uri="http://schemas.microsoft.com/office/word/2010/wordprocessingInk">
-                    <w14:contentPart bwMode="auto" r:id="rId15">
-                      <w14:nvContentPartPr>
-                        <w14:cNvContentPartPr/>
-                      </w14:nvContentPartPr>
-                      <w14:xfrm>
-                        <a:off x="0" y="0"/>
-                        <a:ext cx="360" cy="360"/>
-                      </w14:xfrm>
-                    </w14:contentPart>
-                  </a:graphicData>
-                </a:graphic>
-              </wp:anchor>
-            </w:drawing>
-          </mc:Choice>
-          <mc:Fallback>
-            <w:pict>
-              <v:shapetype w14:anchorId="6AD39FD7" id="_x0000_t75" coordsize="21600,21600" o:spt="75" o:preferrelative="t" path="m@4@5l@4@11@9@11@9@5xe" filled="f" stroked="f">
-                <v:stroke joinstyle="miter"/>
-                <v:formulas>
-                  <v:f eqn="if lineDrawn pixelLineWidth 0"/>
-                  <v:f eqn="sum @0 1 0"/>
-                  <v:f eqn="sum 0 0 @1"/>
-                  <v:f eqn="prod @2 1 2"/>
-                  <v:f eqn="prod @3 21600 pixelWidth"/>
-                  <v:f eqn="prod @3 21600 pixelHeight"/>
-                  <v:f eqn="sum @0 0 1"/>
-                  <v:f eqn="prod @6 1 2"/>
-                  <v:f eqn="prod @7 21600 pixelWidth"/>
-                  <v:f eqn="sum @8 21600 0"/>
-                  <v:f eqn="prod @7 21600 pixelHeight"/>
-                  <v:f eqn="sum @10 21600 0"/>
-                </v:formulas>
-                <v:path o:extrusionok="f" gradientshapeok="t" o:connecttype="rect"/>
-                <o:lock v:ext="edit" aspectratio="t"/>
-              </v:shapetype>
-              <v:shape id="Inkt 4" o:spid="_x0000_s1026" type="#_x0000_t75" style="position:absolute;margin-left:141.95pt;margin-top:194.55pt;width:8.55pt;height:17.05pt;z-index:251659264;visibility:visible;mso-wrap-style:square;mso-wrap-distance-left:9pt;mso-wrap-distance-top:0;mso-wrap-distance-right:9pt;mso-wrap-distance-bottom:0;mso-position-horizontal:absolute;mso-position-horizontal-relative:text;mso-position-vertical:absolute;mso-position-vertical-relative:text" o:gfxdata="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">
-                <v:imagedata r:id="rId16" o:title=""/>
-              </v:shape>
-            </w:pict>
-          </mc:Fallback>
-        </mc:AlternateContent>
-      </w:r>
       <w:r>
         <w:rPr>
           <w:rFonts w:cs="Times New Roman"/>

</xml_diff>